<commit_message>
QA pass on /profile/finance: brand-azure palette, rebuilt logo UI, factual density
- Realign design tokens to the logo's azure blues (#006da3 family, AA kept);
  re-tint washes/glows, mirrors (specs/cvb/offers/downloads), theme-color,
  terms generators + regenerated PDF/DOCX, DESIGN.md
- Replace decorative dot-grid pictures with factual content: advertise-led
  vs search-led side-by-side + three numbered market cases (supplied copy
  only, no invented stats)
- Rebuild client/logo UI: stacked logo bands, uniform white marquee tiles
  (aspect-safe sizing), enlarged pathway tiles; quarantine damaged CIMA
  asset to typographic tile; fix Old Mutual tone tag
- Condense running copy across 12 blocks; chapters/a11y/print unchanged
- 188/188 tests pass, build passes; QA entry in AUDIT_REPORT.md

Co-authored-by: arena-agent <297053741+arena-agent@users.noreply.github.com>
</commit_message>
<xml_diff>
--- a/public/downloads/Talent-Tree-Terms-of-Business.docx
+++ b/public/downloads/Talent-Tree-Terms-of-Business.docx
@@ -12,7 +12,7 @@
           <w:rFonts w:ascii="Georgia" w:cs="Georgia" w:eastAsia="Georgia" w:hAnsi="Georgia"/>
           <w:b/>
           <w:bCs/>
-          <w:color w:val="0A222D"/>
+          <w:color w:val="071F2D"/>
           <w:sz w:val="18"/>
           <w:szCs w:val="18"/>
         </w:rPr>
@@ -28,7 +28,7 @@
           <w:rFonts w:ascii="Georgia" w:cs="Georgia" w:eastAsia="Georgia" w:hAnsi="Georgia"/>
           <w:b/>
           <w:bCs/>
-          <w:color w:val="12303D"/>
+          <w:color w:val="0E2A3A"/>
           <w:sz w:val="26"/>
           <w:szCs w:val="26"/>
         </w:rPr>
@@ -44,7 +44,7 @@
           <w:rFonts w:ascii="Georgia" w:cs="Georgia" w:eastAsia="Georgia" w:hAnsi="Georgia"/>
           <w:b/>
           <w:bCs/>
-          <w:color w:val="136579"/>
+          <w:color w:val="006DA3"/>
           <w:sz w:val="10"/>
           <w:szCs w:val="10"/>
         </w:rPr>
@@ -54,7 +54,7 @@
     <w:p>
       <w:pPr>
         <w:pBdr>
-          <w:bottom w:val="single" w:color="136579" w:sz="6" w:space="4"/>
+          <w:bottom w:val="single" w:color="006DA3" w:sz="6" w:space="4"/>
         </w:pBdr>
         <w:spacing w:after="260"/>
       </w:pPr>
@@ -75,7 +75,7 @@
           <w:rFonts w:ascii="Georgia" w:cs="Georgia" w:eastAsia="Georgia" w:hAnsi="Georgia"/>
           <w:b w:val="false"/>
           <w:bCs w:val="false"/>
-          <w:color w:val="12303D"/>
+          <w:color w:val="0E2A3A"/>
           <w:sz w:val="11"/>
           <w:szCs w:val="11"/>
         </w:rPr>
@@ -91,7 +91,7 @@
           <w:rFonts w:ascii="Georgia" w:cs="Georgia" w:eastAsia="Georgia" w:hAnsi="Georgia"/>
           <w:b w:val="false"/>
           <w:bCs w:val="false"/>
-          <w:color w:val="12303D"/>
+          <w:color w:val="0E2A3A"/>
           <w:sz w:val="11"/>
           <w:szCs w:val="11"/>
         </w:rPr>
@@ -107,7 +107,7 @@
           <w:rFonts w:ascii="Georgia" w:cs="Georgia" w:eastAsia="Georgia" w:hAnsi="Georgia"/>
           <w:b w:val="false"/>
           <w:bCs w:val="false"/>
-          <w:color w:val="12303D"/>
+          <w:color w:val="0E2A3A"/>
           <w:sz w:val="11"/>
           <w:szCs w:val="11"/>
         </w:rPr>
@@ -124,7 +124,7 @@
           <w:rFonts w:ascii="Georgia" w:cs="Georgia" w:eastAsia="Georgia" w:hAnsi="Georgia"/>
           <w:b/>
           <w:bCs/>
-          <w:color w:val="0A222D"/>
+          <w:color w:val="071F2D"/>
           <w:sz w:val="13"/>
           <w:szCs w:val="13"/>
         </w:rPr>
@@ -140,7 +140,7 @@
           <w:rFonts w:ascii="Georgia" w:cs="Georgia" w:eastAsia="Georgia" w:hAnsi="Georgia"/>
           <w:b w:val="false"/>
           <w:bCs w:val="false"/>
-          <w:color w:val="12303D"/>
+          <w:color w:val="0E2A3A"/>
           <w:sz w:val="11"/>
           <w:szCs w:val="11"/>
         </w:rPr>
@@ -156,7 +156,7 @@
           <w:rFonts w:ascii="Georgia" w:cs="Georgia" w:eastAsia="Georgia" w:hAnsi="Georgia"/>
           <w:b w:val="false"/>
           <w:bCs w:val="false"/>
-          <w:color w:val="12303D"/>
+          <w:color w:val="0E2A3A"/>
           <w:sz w:val="11"/>
           <w:szCs w:val="11"/>
         </w:rPr>
@@ -172,7 +172,7 @@
           <w:rFonts w:ascii="Georgia" w:cs="Georgia" w:eastAsia="Georgia" w:hAnsi="Georgia"/>
           <w:b w:val="false"/>
           <w:bCs w:val="false"/>
-          <w:color w:val="12303D"/>
+          <w:color w:val="0E2A3A"/>
           <w:sz w:val="11"/>
           <w:szCs w:val="11"/>
         </w:rPr>
@@ -189,7 +189,7 @@
           <w:rFonts w:ascii="Georgia" w:cs="Georgia" w:eastAsia="Georgia" w:hAnsi="Georgia"/>
           <w:b/>
           <w:bCs/>
-          <w:color w:val="0A222D"/>
+          <w:color w:val="071F2D"/>
           <w:sz w:val="13"/>
           <w:szCs w:val="13"/>
         </w:rPr>
@@ -205,7 +205,7 @@
           <w:rFonts w:ascii="Georgia" w:cs="Georgia" w:eastAsia="Georgia" w:hAnsi="Georgia"/>
           <w:b w:val="false"/>
           <w:bCs w:val="false"/>
-          <w:color w:val="12303D"/>
+          <w:color w:val="0E2A3A"/>
           <w:sz w:val="11"/>
           <w:szCs w:val="11"/>
         </w:rPr>
@@ -221,7 +221,7 @@
           <w:rFonts w:ascii="Georgia" w:cs="Georgia" w:eastAsia="Georgia" w:hAnsi="Georgia"/>
           <w:b w:val="false"/>
           <w:bCs w:val="false"/>
-          <w:color w:val="12303D"/>
+          <w:color w:val="0E2A3A"/>
           <w:sz w:val="11"/>
           <w:szCs w:val="11"/>
         </w:rPr>
@@ -237,7 +237,7 @@
           <w:rFonts w:ascii="Georgia" w:cs="Georgia" w:eastAsia="Georgia" w:hAnsi="Georgia"/>
           <w:b w:val="false"/>
           <w:bCs w:val="false"/>
-          <w:color w:val="12303D"/>
+          <w:color w:val="0E2A3A"/>
           <w:sz w:val="11"/>
           <w:szCs w:val="11"/>
         </w:rPr>
@@ -253,7 +253,7 @@
           <w:rFonts w:ascii="Georgia" w:cs="Georgia" w:eastAsia="Georgia" w:hAnsi="Georgia"/>
           <w:b w:val="false"/>
           <w:bCs w:val="false"/>
-          <w:color w:val="12303D"/>
+          <w:color w:val="0E2A3A"/>
           <w:sz w:val="11"/>
           <w:szCs w:val="11"/>
         </w:rPr>
@@ -269,7 +269,7 @@
           <w:rFonts w:ascii="Georgia" w:cs="Georgia" w:eastAsia="Georgia" w:hAnsi="Georgia"/>
           <w:b w:val="false"/>
           <w:bCs w:val="false"/>
-          <w:color w:val="12303D"/>
+          <w:color w:val="0E2A3A"/>
           <w:sz w:val="11"/>
           <w:szCs w:val="11"/>
         </w:rPr>
@@ -286,7 +286,7 @@
           <w:rFonts w:ascii="Georgia" w:cs="Georgia" w:eastAsia="Georgia" w:hAnsi="Georgia"/>
           <w:b/>
           <w:bCs/>
-          <w:color w:val="0A222D"/>
+          <w:color w:val="071F2D"/>
           <w:sz w:val="13"/>
           <w:szCs w:val="13"/>
         </w:rPr>
@@ -302,7 +302,7 @@
           <w:rFonts w:ascii="Georgia" w:cs="Georgia" w:eastAsia="Georgia" w:hAnsi="Georgia"/>
           <w:b w:val="false"/>
           <w:bCs w:val="false"/>
-          <w:color w:val="12303D"/>
+          <w:color w:val="0E2A3A"/>
           <w:sz w:val="11"/>
           <w:szCs w:val="11"/>
         </w:rPr>
@@ -318,7 +318,7 @@
           <w:rFonts w:ascii="Georgia" w:cs="Georgia" w:eastAsia="Georgia" w:hAnsi="Georgia"/>
           <w:b w:val="false"/>
           <w:bCs w:val="false"/>
-          <w:color w:val="12303D"/>
+          <w:color w:val="0E2A3A"/>
           <w:sz w:val="11"/>
           <w:szCs w:val="11"/>
         </w:rPr>
@@ -334,7 +334,7 @@
           <w:rFonts w:ascii="Georgia" w:cs="Georgia" w:eastAsia="Georgia" w:hAnsi="Georgia"/>
           <w:b w:val="false"/>
           <w:bCs w:val="false"/>
-          <w:color w:val="12303D"/>
+          <w:color w:val="0E2A3A"/>
           <w:sz w:val="11"/>
           <w:szCs w:val="11"/>
         </w:rPr>
@@ -350,7 +350,7 @@
           <w:rFonts w:ascii="Georgia" w:cs="Georgia" w:eastAsia="Georgia" w:hAnsi="Georgia"/>
           <w:b w:val="false"/>
           <w:bCs w:val="false"/>
-          <w:color w:val="12303D"/>
+          <w:color w:val="0E2A3A"/>
           <w:sz w:val="11"/>
           <w:szCs w:val="11"/>
         </w:rPr>
@@ -367,7 +367,7 @@
           <w:rFonts w:ascii="Georgia" w:cs="Georgia" w:eastAsia="Georgia" w:hAnsi="Georgia"/>
           <w:b/>
           <w:bCs/>
-          <w:color w:val="0A222D"/>
+          <w:color w:val="071F2D"/>
           <w:sz w:val="13"/>
           <w:szCs w:val="13"/>
         </w:rPr>
@@ -383,7 +383,7 @@
           <w:rFonts w:ascii="Georgia" w:cs="Georgia" w:eastAsia="Georgia" w:hAnsi="Georgia"/>
           <w:b w:val="false"/>
           <w:bCs w:val="false"/>
-          <w:color w:val="12303D"/>
+          <w:color w:val="0E2A3A"/>
           <w:sz w:val="11"/>
           <w:szCs w:val="11"/>
         </w:rPr>
@@ -399,7 +399,7 @@
           <w:rFonts w:ascii="Georgia" w:cs="Georgia" w:eastAsia="Georgia" w:hAnsi="Georgia"/>
           <w:b w:val="false"/>
           <w:bCs w:val="false"/>
-          <w:color w:val="12303D"/>
+          <w:color w:val="0E2A3A"/>
           <w:sz w:val="11"/>
           <w:szCs w:val="11"/>
         </w:rPr>
@@ -415,7 +415,7 @@
           <w:rFonts w:ascii="Georgia" w:cs="Georgia" w:eastAsia="Georgia" w:hAnsi="Georgia"/>
           <w:b w:val="false"/>
           <w:bCs w:val="false"/>
-          <w:color w:val="12303D"/>
+          <w:color w:val="0E2A3A"/>
           <w:sz w:val="11"/>
           <w:szCs w:val="11"/>
         </w:rPr>
@@ -431,7 +431,7 @@
           <w:rFonts w:ascii="Georgia" w:cs="Georgia" w:eastAsia="Georgia" w:hAnsi="Georgia"/>
           <w:b w:val="false"/>
           <w:bCs w:val="false"/>
-          <w:color w:val="12303D"/>
+          <w:color w:val="0E2A3A"/>
           <w:sz w:val="11"/>
           <w:szCs w:val="11"/>
         </w:rPr>
@@ -448,7 +448,7 @@
           <w:rFonts w:ascii="Georgia" w:cs="Georgia" w:eastAsia="Georgia" w:hAnsi="Georgia"/>
           <w:b/>
           <w:bCs/>
-          <w:color w:val="0A222D"/>
+          <w:color w:val="071F2D"/>
           <w:sz w:val="13"/>
           <w:szCs w:val="13"/>
         </w:rPr>
@@ -464,7 +464,7 @@
           <w:rFonts w:ascii="Georgia" w:cs="Georgia" w:eastAsia="Georgia" w:hAnsi="Georgia"/>
           <w:b w:val="false"/>
           <w:bCs w:val="false"/>
-          <w:color w:val="12303D"/>
+          <w:color w:val="0E2A3A"/>
           <w:sz w:val="11"/>
           <w:szCs w:val="11"/>
         </w:rPr>
@@ -480,7 +480,7 @@
           <w:rFonts w:ascii="Georgia" w:cs="Georgia" w:eastAsia="Georgia" w:hAnsi="Georgia"/>
           <w:b w:val="false"/>
           <w:bCs w:val="false"/>
-          <w:color w:val="12303D"/>
+          <w:color w:val="0E2A3A"/>
           <w:sz w:val="11"/>
           <w:szCs w:val="11"/>
         </w:rPr>
@@ -496,7 +496,7 @@
           <w:rFonts w:ascii="Georgia" w:cs="Georgia" w:eastAsia="Georgia" w:hAnsi="Georgia"/>
           <w:b w:val="false"/>
           <w:bCs w:val="false"/>
-          <w:color w:val="12303D"/>
+          <w:color w:val="0E2A3A"/>
           <w:sz w:val="11"/>
           <w:szCs w:val="11"/>
         </w:rPr>
@@ -512,7 +512,7 @@
           <w:rFonts w:ascii="Georgia" w:cs="Georgia" w:eastAsia="Georgia" w:hAnsi="Georgia"/>
           <w:b w:val="false"/>
           <w:bCs w:val="false"/>
-          <w:color w:val="12303D"/>
+          <w:color w:val="0E2A3A"/>
           <w:sz w:val="11"/>
           <w:szCs w:val="11"/>
         </w:rPr>
@@ -528,7 +528,7 @@
           <w:rFonts w:ascii="Georgia" w:cs="Georgia" w:eastAsia="Georgia" w:hAnsi="Georgia"/>
           <w:b w:val="false"/>
           <w:bCs w:val="false"/>
-          <w:color w:val="12303D"/>
+          <w:color w:val="0E2A3A"/>
           <w:sz w:val="11"/>
           <w:szCs w:val="11"/>
         </w:rPr>
@@ -545,7 +545,7 @@
           <w:rFonts w:ascii="Georgia" w:cs="Georgia" w:eastAsia="Georgia" w:hAnsi="Georgia"/>
           <w:b/>
           <w:bCs/>
-          <w:color w:val="0A222D"/>
+          <w:color w:val="071F2D"/>
           <w:sz w:val="13"/>
           <w:szCs w:val="13"/>
         </w:rPr>
@@ -561,7 +561,7 @@
           <w:rFonts w:ascii="Georgia" w:cs="Georgia" w:eastAsia="Georgia" w:hAnsi="Georgia"/>
           <w:b w:val="false"/>
           <w:bCs w:val="false"/>
-          <w:color w:val="12303D"/>
+          <w:color w:val="0E2A3A"/>
           <w:sz w:val="11"/>
           <w:szCs w:val="11"/>
         </w:rPr>
@@ -577,7 +577,7 @@
           <w:rFonts w:ascii="Georgia" w:cs="Georgia" w:eastAsia="Georgia" w:hAnsi="Georgia"/>
           <w:b w:val="false"/>
           <w:bCs w:val="false"/>
-          <w:color w:val="12303D"/>
+          <w:color w:val="0E2A3A"/>
           <w:sz w:val="11"/>
           <w:szCs w:val="11"/>
         </w:rPr>
@@ -593,7 +593,7 @@
           <w:rFonts w:ascii="Georgia" w:cs="Georgia" w:eastAsia="Georgia" w:hAnsi="Georgia"/>
           <w:b w:val="false"/>
           <w:bCs w:val="false"/>
-          <w:color w:val="12303D"/>
+          <w:color w:val="0E2A3A"/>
           <w:sz w:val="11"/>
           <w:szCs w:val="11"/>
         </w:rPr>
@@ -609,7 +609,7 @@
           <w:rFonts w:ascii="Georgia" w:cs="Georgia" w:eastAsia="Georgia" w:hAnsi="Georgia"/>
           <w:b w:val="false"/>
           <w:bCs w:val="false"/>
-          <w:color w:val="12303D"/>
+          <w:color w:val="0E2A3A"/>
           <w:sz w:val="11"/>
           <w:szCs w:val="11"/>
         </w:rPr>
@@ -626,7 +626,7 @@
           <w:rFonts w:ascii="Georgia" w:cs="Georgia" w:eastAsia="Georgia" w:hAnsi="Georgia"/>
           <w:b/>
           <w:bCs/>
-          <w:color w:val="0A222D"/>
+          <w:color w:val="071F2D"/>
           <w:sz w:val="13"/>
           <w:szCs w:val="13"/>
         </w:rPr>
@@ -642,7 +642,7 @@
           <w:rFonts w:ascii="Georgia" w:cs="Georgia" w:eastAsia="Georgia" w:hAnsi="Georgia"/>
           <w:b w:val="false"/>
           <w:bCs w:val="false"/>
-          <w:color w:val="12303D"/>
+          <w:color w:val="0E2A3A"/>
           <w:sz w:val="11"/>
           <w:szCs w:val="11"/>
         </w:rPr>
@@ -658,7 +658,7 @@
           <w:rFonts w:ascii="Georgia" w:cs="Georgia" w:eastAsia="Georgia" w:hAnsi="Georgia"/>
           <w:b w:val="false"/>
           <w:bCs w:val="false"/>
-          <w:color w:val="12303D"/>
+          <w:color w:val="0E2A3A"/>
           <w:sz w:val="11"/>
           <w:szCs w:val="11"/>
         </w:rPr>
@@ -675,7 +675,7 @@
           <w:rFonts w:ascii="Georgia" w:cs="Georgia" w:eastAsia="Georgia" w:hAnsi="Georgia"/>
           <w:b/>
           <w:bCs/>
-          <w:color w:val="0A222D"/>
+          <w:color w:val="071F2D"/>
           <w:sz w:val="13"/>
           <w:szCs w:val="13"/>
         </w:rPr>
@@ -691,7 +691,7 @@
           <w:rFonts w:ascii="Georgia" w:cs="Georgia" w:eastAsia="Georgia" w:hAnsi="Georgia"/>
           <w:b w:val="false"/>
           <w:bCs w:val="false"/>
-          <w:color w:val="12303D"/>
+          <w:color w:val="0E2A3A"/>
           <w:sz w:val="11"/>
           <w:szCs w:val="11"/>
         </w:rPr>
@@ -707,7 +707,7 @@
           <w:rFonts w:ascii="Georgia" w:cs="Georgia" w:eastAsia="Georgia" w:hAnsi="Georgia"/>
           <w:b w:val="false"/>
           <w:bCs w:val="false"/>
-          <w:color w:val="12303D"/>
+          <w:color w:val="0E2A3A"/>
           <w:sz w:val="11"/>
           <w:szCs w:val="11"/>
         </w:rPr>
@@ -723,7 +723,7 @@
           <w:rFonts w:ascii="Georgia" w:cs="Georgia" w:eastAsia="Georgia" w:hAnsi="Georgia"/>
           <w:b w:val="false"/>
           <w:bCs w:val="false"/>
-          <w:color w:val="12303D"/>
+          <w:color w:val="0E2A3A"/>
           <w:sz w:val="11"/>
           <w:szCs w:val="11"/>
         </w:rPr>
@@ -739,7 +739,7 @@
           <w:rFonts w:ascii="Georgia" w:cs="Georgia" w:eastAsia="Georgia" w:hAnsi="Georgia"/>
           <w:b w:val="false"/>
           <w:bCs w:val="false"/>
-          <w:color w:val="12303D"/>
+          <w:color w:val="0E2A3A"/>
           <w:sz w:val="11"/>
           <w:szCs w:val="11"/>
         </w:rPr>
@@ -756,7 +756,7 @@
           <w:rFonts w:ascii="Georgia" w:cs="Georgia" w:eastAsia="Georgia" w:hAnsi="Georgia"/>
           <w:b/>
           <w:bCs/>
-          <w:color w:val="0A222D"/>
+          <w:color w:val="071F2D"/>
           <w:sz w:val="13"/>
           <w:szCs w:val="13"/>
         </w:rPr>
@@ -772,7 +772,7 @@
           <w:rFonts w:ascii="Georgia" w:cs="Georgia" w:eastAsia="Georgia" w:hAnsi="Georgia"/>
           <w:b w:val="false"/>
           <w:bCs w:val="false"/>
-          <w:color w:val="12303D"/>
+          <w:color w:val="0E2A3A"/>
           <w:sz w:val="11"/>
           <w:szCs w:val="11"/>
         </w:rPr>
@@ -788,7 +788,7 @@
           <w:rFonts w:ascii="Georgia" w:cs="Georgia" w:eastAsia="Georgia" w:hAnsi="Georgia"/>
           <w:b w:val="false"/>
           <w:bCs w:val="false"/>
-          <w:color w:val="12303D"/>
+          <w:color w:val="0E2A3A"/>
           <w:sz w:val="11"/>
           <w:szCs w:val="11"/>
         </w:rPr>
@@ -804,7 +804,7 @@
           <w:rFonts w:ascii="Georgia" w:cs="Georgia" w:eastAsia="Georgia" w:hAnsi="Georgia"/>
           <w:b w:val="false"/>
           <w:bCs w:val="false"/>
-          <w:color w:val="12303D"/>
+          <w:color w:val="0E2A3A"/>
           <w:sz w:val="11"/>
           <w:szCs w:val="11"/>
         </w:rPr>
@@ -820,7 +820,7 @@
           <w:rFonts w:ascii="Georgia" w:cs="Georgia" w:eastAsia="Georgia" w:hAnsi="Georgia"/>
           <w:b w:val="false"/>
           <w:bCs w:val="false"/>
-          <w:color w:val="12303D"/>
+          <w:color w:val="0E2A3A"/>
           <w:sz w:val="11"/>
           <w:szCs w:val="11"/>
         </w:rPr>
@@ -837,7 +837,7 @@
           <w:rFonts w:ascii="Georgia" w:cs="Georgia" w:eastAsia="Georgia" w:hAnsi="Georgia"/>
           <w:b/>
           <w:bCs/>
-          <w:color w:val="0A222D"/>
+          <w:color w:val="071F2D"/>
           <w:sz w:val="13"/>
           <w:szCs w:val="13"/>
         </w:rPr>
@@ -853,7 +853,7 @@
           <w:rFonts w:ascii="Georgia" w:cs="Georgia" w:eastAsia="Georgia" w:hAnsi="Georgia"/>
           <w:b w:val="false"/>
           <w:bCs w:val="false"/>
-          <w:color w:val="12303D"/>
+          <w:color w:val="0E2A3A"/>
           <w:sz w:val="11"/>
           <w:szCs w:val="11"/>
         </w:rPr>
@@ -869,7 +869,7 @@
           <w:rFonts w:ascii="Georgia" w:cs="Georgia" w:eastAsia="Georgia" w:hAnsi="Georgia"/>
           <w:b w:val="false"/>
           <w:bCs w:val="false"/>
-          <w:color w:val="12303D"/>
+          <w:color w:val="0E2A3A"/>
           <w:sz w:val="11"/>
           <w:szCs w:val="11"/>
         </w:rPr>
@@ -885,7 +885,7 @@
           <w:rFonts w:ascii="Georgia" w:cs="Georgia" w:eastAsia="Georgia" w:hAnsi="Georgia"/>
           <w:b w:val="false"/>
           <w:bCs w:val="false"/>
-          <w:color w:val="12303D"/>
+          <w:color w:val="0E2A3A"/>
           <w:sz w:val="11"/>
           <w:szCs w:val="11"/>
         </w:rPr>
@@ -902,7 +902,7 @@
           <w:rFonts w:ascii="Georgia" w:cs="Georgia" w:eastAsia="Georgia" w:hAnsi="Georgia"/>
           <w:b/>
           <w:bCs/>
-          <w:color w:val="0A222D"/>
+          <w:color w:val="071F2D"/>
           <w:sz w:val="13"/>
           <w:szCs w:val="13"/>
         </w:rPr>
@@ -918,7 +918,7 @@
           <w:rFonts w:ascii="Georgia" w:cs="Georgia" w:eastAsia="Georgia" w:hAnsi="Georgia"/>
           <w:b w:val="false"/>
           <w:bCs w:val="false"/>
-          <w:color w:val="12303D"/>
+          <w:color w:val="0E2A3A"/>
           <w:sz w:val="11"/>
           <w:szCs w:val="11"/>
         </w:rPr>
@@ -934,7 +934,7 @@
           <w:rFonts w:ascii="Georgia" w:cs="Georgia" w:eastAsia="Georgia" w:hAnsi="Georgia"/>
           <w:b w:val="false"/>
           <w:bCs w:val="false"/>
-          <w:color w:val="12303D"/>
+          <w:color w:val="0E2A3A"/>
           <w:sz w:val="11"/>
           <w:szCs w:val="11"/>
         </w:rPr>
@@ -950,7 +950,7 @@
           <w:rFonts w:ascii="Georgia" w:cs="Georgia" w:eastAsia="Georgia" w:hAnsi="Georgia"/>
           <w:b w:val="false"/>
           <w:bCs w:val="false"/>
-          <w:color w:val="12303D"/>
+          <w:color w:val="0E2A3A"/>
           <w:sz w:val="11"/>
           <w:szCs w:val="11"/>
         </w:rPr>
@@ -966,7 +966,7 @@
           <w:rFonts w:ascii="Georgia" w:cs="Georgia" w:eastAsia="Georgia" w:hAnsi="Georgia"/>
           <w:b w:val="false"/>
           <w:bCs w:val="false"/>
-          <w:color w:val="12303D"/>
+          <w:color w:val="0E2A3A"/>
           <w:sz w:val="11"/>
           <w:szCs w:val="11"/>
         </w:rPr>
@@ -983,7 +983,7 @@
           <w:rFonts w:ascii="Georgia" w:cs="Georgia" w:eastAsia="Georgia" w:hAnsi="Georgia"/>
           <w:b/>
           <w:bCs/>
-          <w:color w:val="0A222D"/>
+          <w:color w:val="071F2D"/>
           <w:sz w:val="13"/>
           <w:szCs w:val="13"/>
         </w:rPr>
@@ -999,7 +999,7 @@
           <w:rFonts w:ascii="Georgia" w:cs="Georgia" w:eastAsia="Georgia" w:hAnsi="Georgia"/>
           <w:b w:val="false"/>
           <w:bCs w:val="false"/>
-          <w:color w:val="12303D"/>
+          <w:color w:val="0E2A3A"/>
           <w:sz w:val="11"/>
           <w:szCs w:val="11"/>
         </w:rPr>
@@ -1015,7 +1015,7 @@
           <w:rFonts w:ascii="Georgia" w:cs="Georgia" w:eastAsia="Georgia" w:hAnsi="Georgia"/>
           <w:b w:val="false"/>
           <w:bCs w:val="false"/>
-          <w:color w:val="12303D"/>
+          <w:color w:val="0E2A3A"/>
           <w:sz w:val="11"/>
           <w:szCs w:val="11"/>
         </w:rPr>
@@ -1031,7 +1031,7 @@
           <w:rFonts w:ascii="Georgia" w:cs="Georgia" w:eastAsia="Georgia" w:hAnsi="Georgia"/>
           <w:b w:val="false"/>
           <w:bCs w:val="false"/>
-          <w:color w:val="12303D"/>
+          <w:color w:val="0E2A3A"/>
           <w:sz w:val="11"/>
           <w:szCs w:val="11"/>
         </w:rPr>
@@ -1047,7 +1047,7 @@
           <w:rFonts w:ascii="Georgia" w:cs="Georgia" w:eastAsia="Georgia" w:hAnsi="Georgia"/>
           <w:b w:val="false"/>
           <w:bCs w:val="false"/>
-          <w:color w:val="12303D"/>
+          <w:color w:val="0E2A3A"/>
           <w:sz w:val="11"/>
           <w:szCs w:val="11"/>
         </w:rPr>
@@ -1064,7 +1064,7 @@
           <w:rFonts w:ascii="Georgia" w:cs="Georgia" w:eastAsia="Georgia" w:hAnsi="Georgia"/>
           <w:b/>
           <w:bCs/>
-          <w:color w:val="0A222D"/>
+          <w:color w:val="071F2D"/>
           <w:sz w:val="13"/>
           <w:szCs w:val="13"/>
         </w:rPr>
@@ -1080,7 +1080,7 @@
           <w:rFonts w:ascii="Georgia" w:cs="Georgia" w:eastAsia="Georgia" w:hAnsi="Georgia"/>
           <w:b w:val="false"/>
           <w:bCs w:val="false"/>
-          <w:color w:val="12303D"/>
+          <w:color w:val="0E2A3A"/>
           <w:sz w:val="11"/>
           <w:szCs w:val="11"/>
         </w:rPr>
@@ -1096,7 +1096,7 @@
           <w:rFonts w:ascii="Georgia" w:cs="Georgia" w:eastAsia="Georgia" w:hAnsi="Georgia"/>
           <w:b w:val="false"/>
           <w:bCs w:val="false"/>
-          <w:color w:val="12303D"/>
+          <w:color w:val="0E2A3A"/>
           <w:sz w:val="11"/>
           <w:szCs w:val="11"/>
         </w:rPr>
@@ -1113,7 +1113,7 @@
           <w:rFonts w:ascii="Georgia" w:cs="Georgia" w:eastAsia="Georgia" w:hAnsi="Georgia"/>
           <w:b/>
           <w:bCs/>
-          <w:color w:val="0A222D"/>
+          <w:color w:val="071F2D"/>
           <w:sz w:val="13"/>
           <w:szCs w:val="13"/>
         </w:rPr>
@@ -1129,7 +1129,7 @@
           <w:rFonts w:ascii="Georgia" w:cs="Georgia" w:eastAsia="Georgia" w:hAnsi="Georgia"/>
           <w:b w:val="false"/>
           <w:bCs w:val="false"/>
-          <w:color w:val="12303D"/>
+          <w:color w:val="0E2A3A"/>
           <w:sz w:val="11"/>
           <w:szCs w:val="11"/>
         </w:rPr>
@@ -1145,7 +1145,7 @@
           <w:rFonts w:ascii="Georgia" w:cs="Georgia" w:eastAsia="Georgia" w:hAnsi="Georgia"/>
           <w:b w:val="false"/>
           <w:bCs w:val="false"/>
-          <w:color w:val="12303D"/>
+          <w:color w:val="0E2A3A"/>
           <w:sz w:val="11"/>
           <w:szCs w:val="11"/>
         </w:rPr>
@@ -1162,7 +1162,7 @@
           <w:rFonts w:ascii="Georgia" w:cs="Georgia" w:eastAsia="Georgia" w:hAnsi="Georgia"/>
           <w:b/>
           <w:bCs/>
-          <w:color w:val="0A222D"/>
+          <w:color w:val="071F2D"/>
           <w:sz w:val="13"/>
           <w:szCs w:val="13"/>
         </w:rPr>
@@ -1178,7 +1178,7 @@
           <w:rFonts w:ascii="Georgia" w:cs="Georgia" w:eastAsia="Georgia" w:hAnsi="Georgia"/>
           <w:b w:val="false"/>
           <w:bCs w:val="false"/>
-          <w:color w:val="12303D"/>
+          <w:color w:val="0E2A3A"/>
           <w:sz w:val="11"/>
           <w:szCs w:val="11"/>
         </w:rPr>
@@ -1194,7 +1194,7 @@
           <w:rFonts w:ascii="Georgia" w:cs="Georgia" w:eastAsia="Georgia" w:hAnsi="Georgia"/>
           <w:b w:val="false"/>
           <w:bCs w:val="false"/>
-          <w:color w:val="12303D"/>
+          <w:color w:val="0E2A3A"/>
           <w:sz w:val="11"/>
           <w:szCs w:val="11"/>
         </w:rPr>
@@ -1210,7 +1210,7 @@
           <w:rFonts w:ascii="Georgia" w:cs="Georgia" w:eastAsia="Georgia" w:hAnsi="Georgia"/>
           <w:b w:val="false"/>
           <w:bCs w:val="false"/>
-          <w:color w:val="12303D"/>
+          <w:color w:val="0E2A3A"/>
           <w:sz w:val="11"/>
           <w:szCs w:val="11"/>
         </w:rPr>
@@ -1226,7 +1226,7 @@
           <w:rFonts w:ascii="Georgia" w:cs="Georgia" w:eastAsia="Georgia" w:hAnsi="Georgia"/>
           <w:b w:val="false"/>
           <w:bCs w:val="false"/>
-          <w:color w:val="12303D"/>
+          <w:color w:val="0E2A3A"/>
           <w:sz w:val="11"/>
           <w:szCs w:val="11"/>
         </w:rPr>
@@ -1242,7 +1242,7 @@
           <w:rFonts w:ascii="Georgia" w:cs="Georgia" w:eastAsia="Georgia" w:hAnsi="Georgia"/>
           <w:b w:val="false"/>
           <w:bCs w:val="false"/>
-          <w:color w:val="12303D"/>
+          <w:color w:val="0E2A3A"/>
           <w:sz w:val="11"/>
           <w:szCs w:val="11"/>
         </w:rPr>
@@ -1259,7 +1259,7 @@
           <w:rFonts w:ascii="Georgia" w:cs="Georgia" w:eastAsia="Georgia" w:hAnsi="Georgia"/>
           <w:b/>
           <w:bCs/>
-          <w:color w:val="0A222D"/>
+          <w:color w:val="071F2D"/>
           <w:sz w:val="13"/>
           <w:szCs w:val="13"/>
         </w:rPr>
@@ -1275,7 +1275,7 @@
           <w:rFonts w:ascii="Georgia" w:cs="Georgia" w:eastAsia="Georgia" w:hAnsi="Georgia"/>
           <w:b w:val="false"/>
           <w:bCs w:val="false"/>
-          <w:color w:val="12303D"/>
+          <w:color w:val="0E2A3A"/>
           <w:sz w:val="11"/>
           <w:szCs w:val="11"/>
         </w:rPr>
@@ -1291,7 +1291,7 @@
           <w:rFonts w:ascii="Georgia" w:cs="Georgia" w:eastAsia="Georgia" w:hAnsi="Georgia"/>
           <w:b/>
           <w:bCs/>
-          <w:color w:val="0A222D"/>
+          <w:color w:val="071F2D"/>
           <w:sz w:val="10"/>
           <w:szCs w:val="10"/>
         </w:rPr>
@@ -1305,7 +1305,7 @@
       <w:r>
         <w:rPr>
           <w:rFonts w:ascii="Georgia" w:cs="Georgia" w:eastAsia="Georgia" w:hAnsi="Georgia"/>
-          <w:color w:val="136579"/>
+          <w:color w:val="006DA3"/>
           <w:sz w:val="10"/>
           <w:szCs w:val="10"/>
         </w:rPr>
@@ -1319,7 +1319,7 @@
       <w:r>
         <w:rPr>
           <w:rFonts w:ascii="Georgia" w:cs="Georgia" w:eastAsia="Georgia" w:hAnsi="Georgia"/>
-          <w:color w:val="566B76"/>
+          <w:color w:val="4F6B7A"/>
           <w:sz w:val="10"/>
           <w:szCs w:val="10"/>
         </w:rPr>
@@ -1387,7 +1387,7 @@
     <w:r>
       <w:rPr>
         <w:rFonts w:ascii="Georgia" w:cs="Georgia" w:eastAsia="Georgia" w:hAnsi="Georgia"/>
-        <w:color w:val="566B76"/>
+        <w:color w:val="4F6B7A"/>
         <w:sz w:val="9"/>
         <w:szCs w:val="9"/>
       </w:rPr>
@@ -1396,7 +1396,7 @@
     <w:r>
       <w:rPr>
         <w:rFonts w:ascii="Georgia" w:cs="Georgia" w:eastAsia="Georgia" w:hAnsi="Georgia"/>
-        <w:color w:val="566B76"/>
+        <w:color w:val="4F6B7A"/>
         <w:sz w:val="9"/>
         <w:szCs w:val="9"/>
       </w:rPr>

</xml_diff>